<commit_message>
docs(faz8): ADR-102..106, checklist updated with test evidence (Word regenerated)
Co-Authored-By: Claude Sonnet 5.5 <noreply@anthropic.com>
</commit_message>
<xml_diff>
--- a/docs/Egebis-Seyir-ClickUp-Karsilastirma.docx
+++ b/docs/Egebis-Seyir-ClickUp-Karsilastirma.docx
@@ -920,24 +920,24 @@
               <w:bottom w:val="single" w:color="D9D9E3" w:sz="4"/>
               <w:right w:val="single" w:color="D9D9E3" w:sz="4"/>
             </w:tcBorders>
-            <w:shd w:fill="FEE2E2" w:color="auto" w:val="clear"/>
-            <w:tcMar>
-              <w:top w:type="dxa" w:w="60"/>
-              <w:left w:type="dxa" w:w="100"/>
-              <w:bottom w:type="dxa" w:w="60"/>
-              <w:right w:type="dxa" w:w="100"/>
-            </w:tcMar>
-          </w:tcPr>
-          <w:p>
-            <w:r>
-              <w:rPr>
-                <w:b/>
-                <w:bCs/>
-                <w:color w:val="991B1B"/>
-                <w:sz w:val="18"/>
-                <w:szCs w:val="18"/>
-              </w:rPr>
-              <w:t xml:space="preserve">Yok</w:t>
+            <w:shd w:fill="DCFCE7" w:color="auto" w:val="clear"/>
+            <w:tcMar>
+              <w:top w:type="dxa" w:w="60"/>
+              <w:left w:type="dxa" w:w="100"/>
+              <w:bottom w:type="dxa" w:w="60"/>
+              <w:right w:type="dxa" w:w="100"/>
+            </w:tcMar>
+          </w:tcPr>
+          <w:p>
+            <w:r>
+              <w:rPr>
+                <w:b/>
+                <w:bCs/>
+                <w:color w:val="166534"/>
+                <w:sz w:val="18"/>
+                <w:szCs w:val="18"/>
+              </w:rPr>
+              <w:t xml:space="preserve">Var</w:t>
             </w:r>
           </w:p>
         </w:tc>
@@ -957,7 +957,15 @@
               <w:right w:type="dxa" w:w="100"/>
             </w:tcMar>
           </w:tcPr>
-          <w:p/>
+          <w:p>
+            <w:r>
+              <w:rPr>
+                <w:sz w:val="18"/>
+                <w:szCs w:val="18"/>
+              </w:rPr>
+              <w:t xml:space="preserve">Evet — Int backup, E2E faz8-backup</w:t>
+            </w:r>
+          </w:p>
         </w:tc>
         <w:tc>
           <w:tcPr>
@@ -978,19 +986,10 @@
           <w:p>
             <w:r>
               <w:rPr>
-                <w:b/>
-                <w:bCs/>
-                <w:sz w:val="18"/>
-                <w:szCs w:val="18"/>
-              </w:rPr>
-              <w:t xml:space="preserve">F8 (8.5)</w:t>
-            </w:r>
-            <w:r>
-              <w:rPr>
-                <w:sz w:val="18"/>
-                <w:szCs w:val="18"/>
-              </w:rPr>
-              <w:t xml:space="preserve"> — yönetici isteği</w:t>
+                <w:sz w:val="18"/>
+                <w:szCs w:val="18"/>
+              </w:rPr>
+              <w:t xml:space="preserve">Zip; Space yedeği yeni Space olarak, Sprint yedeği yeni sprint olarak yüklenir (ADR-105)</w:t>
             </w:r>
           </w:p>
         </w:tc>
@@ -1396,24 +1395,24 @@
               <w:bottom w:val="single" w:color="D9D9E3" w:sz="4"/>
               <w:right w:val="single" w:color="D9D9E3" w:sz="4"/>
             </w:tcBorders>
-            <w:shd w:fill="FEE2E2" w:color="auto" w:val="clear"/>
-            <w:tcMar>
-              <w:top w:type="dxa" w:w="60"/>
-              <w:left w:type="dxa" w:w="100"/>
-              <w:bottom w:type="dxa" w:w="60"/>
-              <w:right w:type="dxa" w:w="100"/>
-            </w:tcMar>
-          </w:tcPr>
-          <w:p>
-            <w:r>
-              <w:rPr>
-                <w:b/>
-                <w:bCs/>
-                <w:color w:val="991B1B"/>
-                <w:sz w:val="18"/>
-                <w:szCs w:val="18"/>
-              </w:rPr>
-              <w:t xml:space="preserve">Yok</w:t>
+            <w:shd w:fill="DCFCE7" w:color="auto" w:val="clear"/>
+            <w:tcMar>
+              <w:top w:type="dxa" w:w="60"/>
+              <w:left w:type="dxa" w:w="100"/>
+              <w:bottom w:type="dxa" w:w="60"/>
+              <w:right w:type="dxa" w:w="100"/>
+            </w:tcMar>
+          </w:tcPr>
+          <w:p>
+            <w:r>
+              <w:rPr>
+                <w:b/>
+                <w:bCs/>
+                <w:color w:val="166534"/>
+                <w:sz w:val="18"/>
+                <w:szCs w:val="18"/>
+              </w:rPr>
+              <w:t xml:space="preserve">Var</w:t>
             </w:r>
           </w:p>
         </w:tc>
@@ -1433,7 +1432,15 @@
               <w:right w:type="dxa" w:w="100"/>
             </w:tcMar>
           </w:tcPr>
-          <w:p/>
+          <w:p>
+            <w:r>
+              <w:rPr>
+                <w:sz w:val="18"/>
+                <w:szCs w:val="18"/>
+              </w:rPr>
+              <w:t xml:space="preserve">Evet — Int backlog-nest, E2E faz8-backlog-dnd</w:t>
+            </w:r>
+          </w:p>
         </w:tc>
         <w:tc>
           <w:tcPr>
@@ -1454,19 +1461,10 @@
           <w:p>
             <w:r>
               <w:rPr>
-                <w:b/>
-                <w:bCs/>
-                <w:sz w:val="18"/>
-                <w:szCs w:val="18"/>
-              </w:rPr>
-              <w:t xml:space="preserve">F8 (8.2)</w:t>
-            </w:r>
-            <w:r>
-              <w:rPr>
-                <w:sz w:val="18"/>
-                <w:szCs w:val="18"/>
-              </w:rPr>
-              <w:t xml:space="preserve"> — hiyerarşi korunur</w:t>
+                <w:sz w:val="18"/>
+                <w:szCs w:val="18"/>
+              </w:rPr>
+              <w:t xml:space="preserve">Hiyerarşi korunur: Task → Sub-task, üst tip değişmez (ADR-102)</w:t>
             </w:r>
           </w:p>
         </w:tc>
@@ -2178,7 +2176,7 @@
                 <w:sz w:val="18"/>
                 <w:szCs w:val="18"/>
               </w:rPr>
-              <w:t xml:space="preserve">Evet — E2E faz1-detail</w:t>
+              <w:t xml:space="preserve">Evet — E2E faz1-detail, faz8-backlog-dnd</w:t>
             </w:r>
           </w:p>
         </w:tc>
@@ -2204,23 +2202,7 @@
                 <w:sz w:val="18"/>
                 <w:szCs w:val="18"/>
               </w:rPr>
-              <w:t xml:space="preserve">Space genelinde tek sayaç; </w:t>
-            </w:r>
-            <w:r>
-              <w:rPr>
-                <w:b/>
-                <w:bCs/>
-                <w:sz w:val="18"/>
-                <w:szCs w:val="18"/>
-              </w:rPr>
-              <w:t xml:space="preserve">F8 (8.7)</w:t>
-            </w:r>
-            <w:r>
-              <w:rPr>
-                <w:sz w:val="18"/>
-                <w:szCs w:val="18"/>
-              </w:rPr>
-              <w:t xml:space="preserve"> kopyala menüsü</w:t>
+              <w:t xml:space="preserve">Space genelinde tek sayaç; ID’ye tıklayınca bağlantı kopyalanır</w:t>
             </w:r>
           </w:p>
         </w:tc>
@@ -2829,12 +2811,10 @@
           <w:p>
             <w:r>
               <w:rPr>
-                <w:b/>
-                <w:bCs/>
-                <w:sz w:val="18"/>
-                <w:szCs w:val="18"/>
-              </w:rPr>
-              <w:t xml:space="preserve">F8 (8.6)</w:t>
+                <w:sz w:val="18"/>
+                <w:szCs w:val="18"/>
+              </w:rPr>
+              <w:t xml:space="preserve">F9 (yalnız doküman sayfalarında var)</w:t>
             </w:r>
           </w:p>
         </w:tc>
@@ -4327,24 +4307,24 @@
               <w:bottom w:val="single" w:color="D9D9E3" w:sz="4"/>
               <w:right w:val="single" w:color="D9D9E3" w:sz="4"/>
             </w:tcBorders>
-            <w:shd w:fill="FEE2E2" w:color="auto" w:val="clear"/>
-            <w:tcMar>
-              <w:top w:type="dxa" w:w="60"/>
-              <w:left w:type="dxa" w:w="100"/>
-              <w:bottom w:type="dxa" w:w="60"/>
-              <w:right w:type="dxa" w:w="100"/>
-            </w:tcMar>
-          </w:tcPr>
-          <w:p>
-            <w:r>
-              <w:rPr>
-                <w:b/>
-                <w:bCs/>
-                <w:color w:val="991B1B"/>
-                <w:sz w:val="18"/>
-                <w:szCs w:val="18"/>
-              </w:rPr>
-              <w:t xml:space="preserve">Yok</w:t>
+            <w:shd w:fill="DCFCE7" w:color="auto" w:val="clear"/>
+            <w:tcMar>
+              <w:top w:type="dxa" w:w="60"/>
+              <w:left w:type="dxa" w:w="100"/>
+              <w:bottom w:type="dxa" w:w="60"/>
+              <w:right w:type="dxa" w:w="100"/>
+            </w:tcMar>
+          </w:tcPr>
+          <w:p>
+            <w:r>
+              <w:rPr>
+                <w:b/>
+                <w:bCs/>
+                <w:color w:val="166534"/>
+                <w:sz w:val="18"/>
+                <w:szCs w:val="18"/>
+              </w:rPr>
+              <w:t xml:space="preserve">Var</w:t>
             </w:r>
           </w:p>
         </w:tc>
@@ -4364,7 +4344,15 @@
               <w:right w:type="dxa" w:w="100"/>
             </w:tcMar>
           </w:tcPr>
-          <w:p/>
+          <w:p>
+            <w:r>
+              <w:rPr>
+                <w:sz w:val="18"/>
+                <w:szCs w:val="18"/>
+              </w:rPr>
+              <w:t xml:space="preserve">Evet — E2E faz8-backlog-dnd</w:t>
+            </w:r>
+          </w:p>
         </w:tc>
         <w:tc>
           <w:tcPr>
@@ -4385,19 +4373,10 @@
           <w:p>
             <w:r>
               <w:rPr>
-                <w:b/>
-                <w:bCs/>
-                <w:sz w:val="18"/>
-                <w:szCs w:val="18"/>
-              </w:rPr>
-              <w:t xml:space="preserve">F8 (8.1)</w:t>
-            </w:r>
-            <w:r>
-              <w:rPr>
-                <w:sz w:val="18"/>
-                <w:szCs w:val="18"/>
-              </w:rPr>
-              <w:t xml:space="preserve"> — yönetici isteği</w:t>
+                <w:sz w:val="18"/>
+                <w:szCs w:val="18"/>
+              </w:rPr>
+              <w:t xml:space="preserve">Sprint’ler durum noktası ve öğe sayısıyla listelenir</w:t>
             </w:r>
           </w:p>
         </w:tc>
@@ -4438,24 +4417,24 @@
               <w:bottom w:val="single" w:color="D9D9E3" w:sz="4"/>
               <w:right w:val="single" w:color="D9D9E3" w:sz="4"/>
             </w:tcBorders>
-            <w:shd w:fill="FEE2E2" w:color="auto" w:val="clear"/>
-            <w:tcMar>
-              <w:top w:type="dxa" w:w="60"/>
-              <w:left w:type="dxa" w:w="100"/>
-              <w:bottom w:type="dxa" w:w="60"/>
-              <w:right w:type="dxa" w:w="100"/>
-            </w:tcMar>
-          </w:tcPr>
-          <w:p>
-            <w:r>
-              <w:rPr>
-                <w:b/>
-                <w:bCs/>
-                <w:color w:val="991B1B"/>
-                <w:sz w:val="18"/>
-                <w:szCs w:val="18"/>
-              </w:rPr>
-              <w:t xml:space="preserve">Yok</w:t>
+            <w:shd w:fill="DCFCE7" w:color="auto" w:val="clear"/>
+            <w:tcMar>
+              <w:top w:type="dxa" w:w="60"/>
+              <w:left w:type="dxa" w:w="100"/>
+              <w:bottom w:type="dxa" w:w="60"/>
+              <w:right w:type="dxa" w:w="100"/>
+            </w:tcMar>
+          </w:tcPr>
+          <w:p>
+            <w:r>
+              <w:rPr>
+                <w:b/>
+                <w:bCs/>
+                <w:color w:val="166534"/>
+                <w:sz w:val="18"/>
+                <w:szCs w:val="18"/>
+              </w:rPr>
+              <w:t xml:space="preserve">Var</w:t>
             </w:r>
           </w:p>
         </w:tc>
@@ -4475,7 +4454,15 @@
               <w:right w:type="dxa" w:w="100"/>
             </w:tcMar>
           </w:tcPr>
-          <w:p/>
+          <w:p>
+            <w:r>
+              <w:rPr>
+                <w:sz w:val="18"/>
+                <w:szCs w:val="18"/>
+              </w:rPr>
+              <w:t xml:space="preserve">Evet — E2E faz8-backlog-dnd, birim copy-list</w:t>
+            </w:r>
+          </w:p>
         </w:tc>
         <w:tc>
           <w:tcPr>
@@ -4496,12 +4483,10 @@
           <w:p>
             <w:r>
               <w:rPr>
-                <w:b/>
-                <w:bCs/>
-                <w:sz w:val="18"/>
-                <w:szCs w:val="18"/>
-              </w:rPr>
-              <w:t xml:space="preserve">F8 (8.1)</w:t>
+                <w:sz w:val="18"/>
+                <w:szCs w:val="18"/>
+              </w:rPr>
+              <w:t xml:space="preserve">Sekmeyle ayrılmış metin; Excel’e yapışır</w:t>
             </w:r>
           </w:p>
         </w:tc>
@@ -4644,24 +4629,24 @@
               <w:bottom w:val="single" w:color="D9D9E3" w:sz="4"/>
               <w:right w:val="single" w:color="D9D9E3" w:sz="4"/>
             </w:tcBorders>
-            <w:shd w:fill="FEF3C7" w:color="auto" w:val="clear"/>
-            <w:tcMar>
-              <w:top w:type="dxa" w:w="60"/>
-              <w:left w:type="dxa" w:w="100"/>
-              <w:bottom w:type="dxa" w:w="60"/>
-              <w:right w:type="dxa" w:w="100"/>
-            </w:tcMar>
-          </w:tcPr>
-          <w:p>
-            <w:r>
-              <w:rPr>
-                <w:b/>
-                <w:bCs/>
-                <w:color w:val="92400E"/>
-                <w:sz w:val="18"/>
-                <w:szCs w:val="18"/>
-              </w:rPr>
-              <w:t xml:space="preserve">Kısmen</w:t>
+            <w:shd w:fill="DCFCE7" w:color="auto" w:val="clear"/>
+            <w:tcMar>
+              <w:top w:type="dxa" w:w="60"/>
+              <w:left w:type="dxa" w:w="100"/>
+              <w:bottom w:type="dxa" w:w="60"/>
+              <w:right w:type="dxa" w:w="100"/>
+            </w:tcMar>
+          </w:tcPr>
+          <w:p>
+            <w:r>
+              <w:rPr>
+                <w:b/>
+                <w:bCs/>
+                <w:color w:val="166534"/>
+                <w:sz w:val="18"/>
+                <w:szCs w:val="18"/>
+              </w:rPr>
+              <w:t xml:space="preserve">Var</w:t>
             </w:r>
           </w:p>
         </w:tc>
@@ -4687,7 +4672,7 @@
                 <w:sz w:val="18"/>
                 <w:szCs w:val="18"/>
               </w:rPr>
-              <w:t xml:space="preserve">Kısmen — yalnız Planlama ekranında, tek sprint</w:t>
+              <w:t xml:space="preserve">Evet — E2E faz8-backlog-dnd, Int backlog-nest</w:t>
             </w:r>
           </w:p>
         </w:tc>
@@ -4710,12 +4695,10 @@
           <w:p>
             <w:r>
               <w:rPr>
-                <w:b/>
-                <w:bCs/>
-                <w:sz w:val="18"/>
-                <w:szCs w:val="18"/>
-              </w:rPr>
-              <w:t xml:space="preserve">F8 (8.2)</w:t>
+                <w:sz w:val="18"/>
+                <w:szCs w:val="18"/>
+              </w:rPr>
+              <w:t xml:space="preserve">Aktif sprint’e/sprint’ten taşımada onay istenir</w:t>
             </w:r>
           </w:p>
         </w:tc>
@@ -5062,24 +5045,24 @@
               <w:bottom w:val="single" w:color="D9D9E3" w:sz="4"/>
               <w:right w:val="single" w:color="D9D9E3" w:sz="4"/>
             </w:tcBorders>
-            <w:shd w:fill="FEE2E2" w:color="auto" w:val="clear"/>
-            <w:tcMar>
-              <w:top w:type="dxa" w:w="60"/>
-              <w:left w:type="dxa" w:w="100"/>
-              <w:bottom w:type="dxa" w:w="60"/>
-              <w:right w:type="dxa" w:w="100"/>
-            </w:tcMar>
-          </w:tcPr>
-          <w:p>
-            <w:r>
-              <w:rPr>
-                <w:b/>
-                <w:bCs/>
-                <w:color w:val="991B1B"/>
-                <w:sz w:val="18"/>
-                <w:szCs w:val="18"/>
-              </w:rPr>
-              <w:t xml:space="preserve">Yok</w:t>
+            <w:shd w:fill="DCFCE7" w:color="auto" w:val="clear"/>
+            <w:tcMar>
+              <w:top w:type="dxa" w:w="60"/>
+              <w:left w:type="dxa" w:w="100"/>
+              <w:bottom w:type="dxa" w:w="60"/>
+              <w:right w:type="dxa" w:w="100"/>
+            </w:tcMar>
+          </w:tcPr>
+          <w:p>
+            <w:r>
+              <w:rPr>
+                <w:b/>
+                <w:bCs/>
+                <w:color w:val="166534"/>
+                <w:sz w:val="18"/>
+                <w:szCs w:val="18"/>
+              </w:rPr>
+              <w:t xml:space="preserve">Var</w:t>
             </w:r>
           </w:p>
         </w:tc>
@@ -5099,7 +5082,15 @@
               <w:right w:type="dxa" w:w="100"/>
             </w:tcMar>
           </w:tcPr>
-          <w:p/>
+          <w:p>
+            <w:r>
+              <w:rPr>
+                <w:sz w:val="18"/>
+                <w:szCs w:val="18"/>
+              </w:rPr>
+              <w:t xml:space="preserve">Evet — Int sprint-excel, E2E faz8-excel</w:t>
+            </w:r>
+          </w:p>
         </w:tc>
         <w:tc>
           <w:tcPr>
@@ -5120,19 +5111,10 @@
           <w:p>
             <w:r>
               <w:rPr>
-                <w:b/>
-                <w:bCs/>
-                <w:sz w:val="18"/>
-                <w:szCs w:val="18"/>
-              </w:rPr>
-              <w:t xml:space="preserve">F8 (8.4)</w:t>
-            </w:r>
-            <w:r>
-              <w:rPr>
-                <w:sz w:val="18"/>
-                <w:szCs w:val="18"/>
-              </w:rPr>
-              <w:t xml:space="preserve"> — şu an yalnız List bazlı CSV var</w:t>
+                <w:sz w:val="18"/>
+                <w:szCs w:val="18"/>
+              </w:rPr>
+              <w:t xml:space="preserve">Öğeler, özellikler, alt öğeler ve bağımlılıklar; önizlemeli içe aktarma (ADR-104)</w:t>
             </w:r>
           </w:p>
         </w:tc>
@@ -6147,11 +6129,10 @@
           <w:p>
             <w:r>
               <w:rPr>
-                <w:color w:val="92400E"/>
-                <w:sz w:val="18"/>
-                <w:szCs w:val="18"/>
-              </w:rPr>
-              <w:t xml:space="preserve">Doğrulanmadı</w:t>
+                <w:sz w:val="18"/>
+                <w:szCs w:val="18"/>
+              </w:rPr>
+              <w:t xml:space="preserve">Evet — E2E faz8-docs</w:t>
             </w:r>
           </w:p>
         </w:tc>
@@ -6210,24 +6191,24 @@
               <w:bottom w:val="single" w:color="D9D9E3" w:sz="4"/>
               <w:right w:val="single" w:color="D9D9E3" w:sz="4"/>
             </w:tcBorders>
-            <w:shd w:fill="FEE2E2" w:color="auto" w:val="clear"/>
-            <w:tcMar>
-              <w:top w:type="dxa" w:w="60"/>
-              <w:left w:type="dxa" w:w="100"/>
-              <w:bottom w:type="dxa" w:w="60"/>
-              <w:right w:type="dxa" w:w="100"/>
-            </w:tcMar>
-          </w:tcPr>
-          <w:p>
-            <w:r>
-              <w:rPr>
-                <w:b/>
-                <w:bCs/>
-                <w:color w:val="991B1B"/>
-                <w:sz w:val="18"/>
-                <w:szCs w:val="18"/>
-              </w:rPr>
-              <w:t xml:space="preserve">Yok</w:t>
+            <w:shd w:fill="DCFCE7" w:color="auto" w:val="clear"/>
+            <w:tcMar>
+              <w:top w:type="dxa" w:w="60"/>
+              <w:left w:type="dxa" w:w="100"/>
+              <w:bottom w:type="dxa" w:w="60"/>
+              <w:right w:type="dxa" w:w="100"/>
+            </w:tcMar>
+          </w:tcPr>
+          <w:p>
+            <w:r>
+              <w:rPr>
+                <w:b/>
+                <w:bCs/>
+                <w:color w:val="166534"/>
+                <w:sz w:val="18"/>
+                <w:szCs w:val="18"/>
+              </w:rPr>
+              <w:t xml:space="preserve">Var</w:t>
             </w:r>
           </w:p>
         </w:tc>
@@ -6247,7 +6228,15 @@
               <w:right w:type="dxa" w:w="100"/>
             </w:tcMar>
           </w:tcPr>
-          <w:p/>
+          <w:p>
+            <w:r>
+              <w:rPr>
+                <w:sz w:val="18"/>
+                <w:szCs w:val="18"/>
+              </w:rPr>
+              <w:t xml:space="preserve">Evet — Int docs, backup, E2E faz8-docs</w:t>
+            </w:r>
+          </w:p>
         </w:tc>
         <w:tc>
           <w:tcPr>
@@ -6268,19 +6257,10 @@
           <w:p>
             <w:r>
               <w:rPr>
-                <w:b/>
-                <w:bCs/>
-                <w:sz w:val="18"/>
-                <w:szCs w:val="18"/>
-              </w:rPr>
-              <w:t xml:space="preserve">F8 (8.6)</w:t>
-            </w:r>
-            <w:r>
-              <w:rPr>
-                <w:sz w:val="18"/>
-                <w:szCs w:val="18"/>
-              </w:rPr>
-              <w:t xml:space="preserve"> — yönetici isteği</w:t>
+                <w:sz w:val="18"/>
+                <w:szCs w:val="18"/>
+              </w:rPr>
+              <w:t xml:space="preserve">Araç çubuğu, yapıştırma, sürükle-bırak (ADR-106)</w:t>
             </w:r>
           </w:p>
         </w:tc>
@@ -6463,11 +6443,10 @@
           <w:p>
             <w:r>
               <w:rPr>
-                <w:color w:val="92400E"/>
-                <w:sz w:val="18"/>
-                <w:szCs w:val="18"/>
-              </w:rPr>
-              <w:t xml:space="preserve">Doğrulanmadı</w:t>
+                <w:sz w:val="18"/>
+                <w:szCs w:val="18"/>
+              </w:rPr>
+              <w:t xml:space="preserve">Evet — E2E faz8-docs</w:t>
             </w:r>
           </w:p>
         </w:tc>
@@ -6490,19 +6469,10 @@
           <w:p>
             <w:r>
               <w:rPr>
-                <w:b/>
-                <w:bCs/>
-                <w:sz w:val="18"/>
-                <w:szCs w:val="18"/>
-              </w:rPr>
-              <w:t xml:space="preserve">F8</w:t>
-            </w:r>
-            <w:r>
-              <w:rPr>
-                <w:sz w:val="18"/>
-                <w:szCs w:val="18"/>
-              </w:rPr>
-              <w:t xml:space="preserve">: E2E ile kanıtlanacak</w:t>
+                <w:sz w:val="18"/>
+                <w:szCs w:val="18"/>
+              </w:rPr>
+              <w:t xml:space="preserve">Araç çubuğu ve Ctrl+Z / Ctrl+Shift+Z</w:t>
             </w:r>
           </w:p>
         </w:tc>
@@ -6693,11 +6663,10 @@
           <w:p>
             <w:r>
               <w:rPr>
-                <w:color w:val="92400E"/>
-                <w:sz w:val="18"/>
-                <w:szCs w:val="18"/>
-              </w:rPr>
-              <w:t xml:space="preserve">Doğrulanmadı</w:t>
+                <w:sz w:val="18"/>
+                <w:szCs w:val="18"/>
+              </w:rPr>
+              <w:t xml:space="preserve">Evet — E2E faz8-docs (yazdırma görünümü)</w:t>
             </w:r>
           </w:p>
         </w:tc>
@@ -6764,24 +6733,24 @@
               <w:bottom w:val="single" w:color="D9D9E3" w:sz="4"/>
               <w:right w:val="single" w:color="D9D9E3" w:sz="4"/>
             </w:tcBorders>
-            <w:shd w:fill="FEE2E2" w:color="auto" w:val="clear"/>
-            <w:tcMar>
-              <w:top w:type="dxa" w:w="60"/>
-              <w:left w:type="dxa" w:w="100"/>
-              <w:bottom w:type="dxa" w:w="60"/>
-              <w:right w:type="dxa" w:w="100"/>
-            </w:tcMar>
-          </w:tcPr>
-          <w:p>
-            <w:r>
-              <w:rPr>
-                <w:b/>
-                <w:bCs/>
-                <w:color w:val="991B1B"/>
-                <w:sz w:val="18"/>
-                <w:szCs w:val="18"/>
-              </w:rPr>
-              <w:t xml:space="preserve">Yok</w:t>
+            <w:shd w:fill="DCFCE7" w:color="auto" w:val="clear"/>
+            <w:tcMar>
+              <w:top w:type="dxa" w:w="60"/>
+              <w:left w:type="dxa" w:w="100"/>
+              <w:bottom w:type="dxa" w:w="60"/>
+              <w:right w:type="dxa" w:w="100"/>
+            </w:tcMar>
+          </w:tcPr>
+          <w:p>
+            <w:r>
+              <w:rPr>
+                <w:b/>
+                <w:bCs/>
+                <w:color w:val="166534"/>
+                <w:sz w:val="18"/>
+                <w:szCs w:val="18"/>
+              </w:rPr>
+              <w:t xml:space="preserve">Var</w:t>
             </w:r>
           </w:p>
         </w:tc>
@@ -6801,7 +6770,15 @@
               <w:right w:type="dxa" w:w="100"/>
             </w:tcMar>
           </w:tcPr>
-          <w:p/>
+          <w:p>
+            <w:r>
+              <w:rPr>
+                <w:sz w:val="18"/>
+                <w:szCs w:val="18"/>
+              </w:rPr>
+              <w:t xml:space="preserve">Evet — E2E faz8-docs, birim doc-docx</w:t>
+            </w:r>
+          </w:p>
         </w:tc>
         <w:tc>
           <w:tcPr>
@@ -6822,19 +6799,10 @@
           <w:p>
             <w:r>
               <w:rPr>
-                <w:b/>
-                <w:bCs/>
-                <w:sz w:val="18"/>
-                <w:szCs w:val="18"/>
-              </w:rPr>
-              <w:t xml:space="preserve">F8 (8.6)</w:t>
-            </w:r>
-            <w:r>
-              <w:rPr>
-                <w:sz w:val="18"/>
-                <w:szCs w:val="18"/>
-              </w:rPr>
-              <w:t xml:space="preserve"> — yönetici isteği</w:t>
+                <w:sz w:val="18"/>
+                <w:szCs w:val="18"/>
+              </w:rPr>
+              <w:t xml:space="preserve">Başlık, liste, tablo, bağlantı ve görsel dahil</w:t>
             </w:r>
           </w:p>
         </w:tc>
@@ -6915,11 +6883,10 @@
           <w:p>
             <w:r>
               <w:rPr>
-                <w:color w:val="92400E"/>
-                <w:sz w:val="18"/>
-                <w:szCs w:val="18"/>
-              </w:rPr>
-              <w:t xml:space="preserve">Doğrulanmadı</w:t>
+                <w:sz w:val="18"/>
+                <w:szCs w:val="18"/>
+              </w:rPr>
+              <w:t xml:space="preserve">Evet — birim doc-export</w:t>
             </w:r>
           </w:p>
         </w:tc>
@@ -9670,24 +9637,24 @@
               <w:bottom w:val="single" w:color="D9D9E3" w:sz="4"/>
               <w:right w:val="single" w:color="D9D9E3" w:sz="4"/>
             </w:tcBorders>
-            <w:shd w:fill="FEE2E2" w:color="auto" w:val="clear"/>
-            <w:tcMar>
-              <w:top w:type="dxa" w:w="60"/>
-              <w:left w:type="dxa" w:w="100"/>
-              <w:bottom w:type="dxa" w:w="60"/>
-              <w:right w:type="dxa" w:w="100"/>
-            </w:tcMar>
-          </w:tcPr>
-          <w:p>
-            <w:r>
-              <w:rPr>
-                <w:b/>
-                <w:bCs/>
-                <w:color w:val="991B1B"/>
-                <w:sz w:val="18"/>
-                <w:szCs w:val="18"/>
-              </w:rPr>
-              <w:t xml:space="preserve">Yok</w:t>
+            <w:shd w:fill="DCFCE7" w:color="auto" w:val="clear"/>
+            <w:tcMar>
+              <w:top w:type="dxa" w:w="60"/>
+              <w:left w:type="dxa" w:w="100"/>
+              <w:bottom w:type="dxa" w:w="60"/>
+              <w:right w:type="dxa" w:w="100"/>
+            </w:tcMar>
+          </w:tcPr>
+          <w:p>
+            <w:r>
+              <w:rPr>
+                <w:b/>
+                <w:bCs/>
+                <w:color w:val="166534"/>
+                <w:sz w:val="18"/>
+                <w:szCs w:val="18"/>
+              </w:rPr>
+              <w:t xml:space="preserve">Var</w:t>
             </w:r>
           </w:p>
         </w:tc>
@@ -9707,35 +9674,33 @@
               <w:right w:type="dxa" w:w="100"/>
             </w:tcMar>
           </w:tcPr>
+          <w:p>
+            <w:r>
+              <w:rPr>
+                <w:sz w:val="18"/>
+                <w:szCs w:val="18"/>
+              </w:rPr>
+              <w:t xml:space="preserve">Evet — Int sprint-excel, E2E faz8-excel</w:t>
+            </w:r>
+          </w:p>
+        </w:tc>
+        <w:tc>
+          <w:tcPr>
+            <w:tcW w:type="dxa" w:w="5000"/>
+            <w:tcBorders>
+              <w:top w:val="single" w:color="D9D9E3" w:sz="4"/>
+              <w:left w:val="single" w:color="D9D9E3" w:sz="4"/>
+              <w:bottom w:val="single" w:color="D9D9E3" w:sz="4"/>
+              <w:right w:val="single" w:color="D9D9E3" w:sz="4"/>
+            </w:tcBorders>
+            <w:tcMar>
+              <w:top w:type="dxa" w:w="60"/>
+              <w:left w:type="dxa" w:w="100"/>
+              <w:bottom w:type="dxa" w:w="60"/>
+              <w:right w:type="dxa" w:w="100"/>
+            </w:tcMar>
+          </w:tcPr>
           <w:p/>
-        </w:tc>
-        <w:tc>
-          <w:tcPr>
-            <w:tcW w:type="dxa" w:w="5000"/>
-            <w:tcBorders>
-              <w:top w:val="single" w:color="D9D9E3" w:sz="4"/>
-              <w:left w:val="single" w:color="D9D9E3" w:sz="4"/>
-              <w:bottom w:val="single" w:color="D9D9E3" w:sz="4"/>
-              <w:right w:val="single" w:color="D9D9E3" w:sz="4"/>
-            </w:tcBorders>
-            <w:tcMar>
-              <w:top w:type="dxa" w:w="60"/>
-              <w:left w:type="dxa" w:w="100"/>
-              <w:bottom w:type="dxa" w:w="60"/>
-              <w:right w:type="dxa" w:w="100"/>
-            </w:tcMar>
-          </w:tcPr>
-          <w:p>
-            <w:r>
-              <w:rPr>
-                <w:b/>
-                <w:bCs/>
-                <w:sz w:val="18"/>
-                <w:szCs w:val="18"/>
-              </w:rPr>
-              <w:t xml:space="preserve">F8 (8.4)</w:t>
-            </w:r>
-          </w:p>
         </w:tc>
       </w:tr>
       <w:tr>
@@ -10547,24 +10512,24 @@
               <w:bottom w:val="single" w:color="D9D9E3" w:sz="4"/>
               <w:right w:val="single" w:color="D9D9E3" w:sz="4"/>
             </w:tcBorders>
-            <w:shd w:fill="FEF3C7" w:color="auto" w:val="clear"/>
-            <w:tcMar>
-              <w:top w:type="dxa" w:w="60"/>
-              <w:left w:type="dxa" w:w="100"/>
-              <w:bottom w:type="dxa" w:w="60"/>
-              <w:right w:type="dxa" w:w="100"/>
-            </w:tcMar>
-          </w:tcPr>
-          <w:p>
-            <w:r>
-              <w:rPr>
-                <w:b/>
-                <w:bCs/>
-                <w:color w:val="92400E"/>
-                <w:sz w:val="18"/>
-                <w:szCs w:val="18"/>
-              </w:rPr>
-              <w:t xml:space="preserve">Kısmen</w:t>
+            <w:shd w:fill="DCFCE7" w:color="auto" w:val="clear"/>
+            <w:tcMar>
+              <w:top w:type="dxa" w:w="60"/>
+              <w:left w:type="dxa" w:w="100"/>
+              <w:bottom w:type="dxa" w:w="60"/>
+              <w:right w:type="dxa" w:w="100"/>
+            </w:tcMar>
+          </w:tcPr>
+          <w:p>
+            <w:r>
+              <w:rPr>
+                <w:b/>
+                <w:bCs/>
+                <w:color w:val="166534"/>
+                <w:sz w:val="18"/>
+                <w:szCs w:val="18"/>
+              </w:rPr>
+              <w:t xml:space="preserve">Var</w:t>
             </w:r>
           </w:p>
         </w:tc>
@@ -10590,7 +10555,7 @@
                 <w:sz w:val="18"/>
                 <w:szCs w:val="18"/>
               </w:rPr>
-              <w:t xml:space="preserve">Kısmen — kayıt tutuluyor, toplu ekran yok</w:t>
+              <w:t xml:space="preserve">Evet — Int audit, E2E faz8-audit</w:t>
             </w:r>
           </w:p>
         </w:tc>
@@ -10613,19 +10578,10 @@
           <w:p>
             <w:r>
               <w:rPr>
-                <w:b/>
-                <w:bCs/>
-                <w:sz w:val="18"/>
-                <w:szCs w:val="18"/>
-              </w:rPr>
-              <w:t xml:space="preserve">F8 (8.3)</w:t>
-            </w:r>
-            <w:r>
-              <w:rPr>
-                <w:sz w:val="18"/>
-                <w:szCs w:val="18"/>
-              </w:rPr>
-              <w:t xml:space="preserve"> — yönetici isteği (önemli)</w:t>
+                <w:sz w:val="18"/>
+                <w:szCs w:val="18"/>
+              </w:rPr>
+              <w:t xml:space="preserve">Kişi, tür, eylem ve tarihle süzülür; CSV indirilir (ADR-103)</w:t>
             </w:r>
           </w:p>
         </w:tc>
@@ -10866,7 +10822,7 @@
           <w:sz w:val="21"/>
           <w:szCs w:val="21"/>
         </w:rPr>
-        <w:t xml:space="preserve">Toplam 81 fonksiyon: ✅ Var 61 · 🟡 Kısmen 2 · ❌ Yok 18. Var olanlardan 57 tanesi otomatik testle kanıtlı, 4 tanesi henüz doğrulanmadı (Faz 8 içinde testlenecek).</w:t>
+        <w:t xml:space="preserve">Toplam 85 fonksiyon: ✅ Var 74 · 🟡 Kısmen 0 · ❌ Yok 11. Var olan 74 fonksiyonun tamamı otomatik testle kanıtlıdır.</w:t>
       </w:r>
     </w:p>
     <w:p>
@@ -10885,14 +10841,14 @@
           <w:sz w:val="21"/>
           <w:szCs w:val="21"/>
         </w:rPr>
-        <w:t xml:space="preserve">Faz 8'de yapılacaklar (yönetici istekleri):</w:t>
+        <w:t xml:space="preserve">Faz 8’de tamamlananlar (yönetici istekleri):</w:t>
       </w:r>
       <w:r>
         <w:rPr>
           <w:sz w:val="21"/>
           <w:szCs w:val="21"/>
         </w:rPr>
-        <w:t xml:space="preserve"> sol menü sprint ağacı, sprint listesini kopyalama, tam sürükle-bırak (backlog ↔ sprint ↔ sprint), sürükleyerek alt görev, denetim logu ekranı, sprint Excel dışa/içe aktarma (bağımlılıklarla), Space/Sprint zip yedek ve geri yükleme, dokümana görsel, Word'e aktarma, Undo/Redo ve PDF'in testle kanıtlanması.</w:t>
+        <w:t xml:space="preserve"> sol menü sprint ağacı, sprint listesini kopyalama, tam sürükle-bırak (backlog ↔ sprint ↔ sprint), sürükleyerek alt görev, denetim logu ekranı, sprint Excel dışa/içe aktarma (bağımlılıklarla), Space/Sprint zip yedek ve geri yükleme, dokümanda görsel, Word’e aktarma, Undo/Redo ve ID bağlantısı testle kanıtlandı.</w:t>
       </w:r>
     </w:p>
     <w:p>

</xml_diff>

<commit_message>
feat: story points on every item, sub-task rollup, percent done, sprint summary, JSON export, sprint URL (ADR-107)
Co-Authored-By: Claude Sonnet 5.5 <noreply@anthropic.com>
</commit_message>
<xml_diff>
--- a/docs/Egebis-Seyir-ClickUp-Karsilastirma.docx
+++ b/docs/Egebis-Seyir-ClickUp-Karsilastirma.docx
@@ -195,7 +195,7 @@
           <w:sz w:val="19"/>
           <w:szCs w:val="19"/>
         </w:rPr>
-        <w:t xml:space="preserve">Son güncelleme: 2026-10-09.</w:t>
+        <w:t xml:space="preserve">Son güncelleme: 2026-10-12.</w:t>
       </w:r>
     </w:p>
     <w:p>
@@ -5119,6 +5119,886 @@
           </w:p>
         </w:tc>
       </w:tr>
+      <w:tr>
+        <w:tc>
+          <w:tcPr>
+            <w:tcW w:type="dxa" w:w="4300"/>
+            <w:tcBorders>
+              <w:top w:val="single" w:color="D9D9E3" w:sz="4"/>
+              <w:left w:val="single" w:color="D9D9E3" w:sz="4"/>
+              <w:bottom w:val="single" w:color="D9D9E3" w:sz="4"/>
+              <w:right w:val="single" w:color="D9D9E3" w:sz="4"/>
+            </w:tcBorders>
+            <w:tcMar>
+              <w:top w:type="dxa" w:w="60"/>
+              <w:left w:type="dxa" w:w="100"/>
+              <w:bottom w:type="dxa" w:w="60"/>
+              <w:right w:type="dxa" w:w="100"/>
+            </w:tcMar>
+          </w:tcPr>
+          <w:p>
+            <w:r>
+              <w:rPr>
+                <w:sz w:val="18"/>
+                <w:szCs w:val="18"/>
+              </w:rPr>
+              <w:t xml:space="preserve">Her göreve Story Point (1,2,3,5,8,13,21,34,55)</w:t>
+            </w:r>
+          </w:p>
+        </w:tc>
+        <w:tc>
+          <w:tcPr>
+            <w:tcW w:type="dxa" w:w="1100"/>
+            <w:tcBorders>
+              <w:top w:val="single" w:color="D9D9E3" w:sz="4"/>
+              <w:left w:val="single" w:color="D9D9E3" w:sz="4"/>
+              <w:bottom w:val="single" w:color="D9D9E3" w:sz="4"/>
+              <w:right w:val="single" w:color="D9D9E3" w:sz="4"/>
+            </w:tcBorders>
+            <w:shd w:fill="DCFCE7" w:color="auto" w:val="clear"/>
+            <w:tcMar>
+              <w:top w:type="dxa" w:w="60"/>
+              <w:left w:type="dxa" w:w="100"/>
+              <w:bottom w:type="dxa" w:w="60"/>
+              <w:right w:type="dxa" w:w="100"/>
+            </w:tcMar>
+          </w:tcPr>
+          <w:p>
+            <w:r>
+              <w:rPr>
+                <w:b/>
+                <w:bCs/>
+                <w:color w:val="166534"/>
+                <w:sz w:val="18"/>
+                <w:szCs w:val="18"/>
+              </w:rPr>
+              <w:t xml:space="preserve">Var</w:t>
+            </w:r>
+          </w:p>
+        </w:tc>
+        <w:tc>
+          <w:tcPr>
+            <w:tcW w:type="dxa" w:w="3600"/>
+            <w:tcBorders>
+              <w:top w:val="single" w:color="D9D9E3" w:sz="4"/>
+              <w:left w:val="single" w:color="D9D9E3" w:sz="4"/>
+              <w:bottom w:val="single" w:color="D9D9E3" w:sz="4"/>
+              <w:right w:val="single" w:color="D9D9E3" w:sz="4"/>
+            </w:tcBorders>
+            <w:tcMar>
+              <w:top w:type="dxa" w:w="60"/>
+              <w:left w:type="dxa" w:w="100"/>
+              <w:bottom w:type="dxa" w:w="60"/>
+              <w:right w:type="dxa" w:w="100"/>
+            </w:tcMar>
+          </w:tcPr>
+          <w:p>
+            <w:r>
+              <w:rPr>
+                <w:sz w:val="18"/>
+                <w:szCs w:val="18"/>
+              </w:rPr>
+              <w:t xml:space="preserve">Evet — Int story-points, E2E faz9-points</w:t>
+            </w:r>
+          </w:p>
+        </w:tc>
+        <w:tc>
+          <w:tcPr>
+            <w:tcW w:type="dxa" w:w="5000"/>
+            <w:tcBorders>
+              <w:top w:val="single" w:color="D9D9E3" w:sz="4"/>
+              <w:left w:val="single" w:color="D9D9E3" w:sz="4"/>
+              <w:bottom w:val="single" w:color="D9D9E3" w:sz="4"/>
+              <w:right w:val="single" w:color="D9D9E3" w:sz="4"/>
+            </w:tcBorders>
+            <w:tcMar>
+              <w:top w:type="dxa" w:w="60"/>
+              <w:left w:type="dxa" w:w="100"/>
+              <w:bottom w:type="dxa" w:w="60"/>
+              <w:right w:type="dxa" w:w="100"/>
+            </w:tcMar>
+          </w:tcPr>
+          <w:p>
+            <w:r>
+              <w:rPr>
+                <w:sz w:val="18"/>
+                <w:szCs w:val="18"/>
+              </w:rPr>
+              <w:t xml:space="preserve">Task/Bug/Story/Sub-task'ta girilir; ölçek dışı değer reddedilir (ADR-107)</w:t>
+            </w:r>
+          </w:p>
+        </w:tc>
+      </w:tr>
+      <w:tr>
+        <w:tc>
+          <w:tcPr>
+            <w:tcW w:type="dxa" w:w="4300"/>
+            <w:tcBorders>
+              <w:top w:val="single" w:color="D9D9E3" w:sz="4"/>
+              <w:left w:val="single" w:color="D9D9E3" w:sz="4"/>
+              <w:bottom w:val="single" w:color="D9D9E3" w:sz="4"/>
+              <w:right w:val="single" w:color="D9D9E3" w:sz="4"/>
+            </w:tcBorders>
+            <w:tcMar>
+              <w:top w:type="dxa" w:w="60"/>
+              <w:left w:type="dxa" w:w="100"/>
+              <w:bottom w:type="dxa" w:w="60"/>
+              <w:right w:type="dxa" w:w="100"/>
+            </w:tcMar>
+          </w:tcPr>
+          <w:p>
+            <w:r>
+              <w:rPr>
+                <w:sz w:val="18"/>
+                <w:szCs w:val="18"/>
+              </w:rPr>
+              <w:t xml:space="preserve">Alt görevi olan işin puanı = alt görev toplamı</w:t>
+            </w:r>
+          </w:p>
+        </w:tc>
+        <w:tc>
+          <w:tcPr>
+            <w:tcW w:type="dxa" w:w="1100"/>
+            <w:tcBorders>
+              <w:top w:val="single" w:color="D9D9E3" w:sz="4"/>
+              <w:left w:val="single" w:color="D9D9E3" w:sz="4"/>
+              <w:bottom w:val="single" w:color="D9D9E3" w:sz="4"/>
+              <w:right w:val="single" w:color="D9D9E3" w:sz="4"/>
+            </w:tcBorders>
+            <w:shd w:fill="DCFCE7" w:color="auto" w:val="clear"/>
+            <w:tcMar>
+              <w:top w:type="dxa" w:w="60"/>
+              <w:left w:type="dxa" w:w="100"/>
+              <w:bottom w:type="dxa" w:w="60"/>
+              <w:right w:type="dxa" w:w="100"/>
+            </w:tcMar>
+          </w:tcPr>
+          <w:p>
+            <w:r>
+              <w:rPr>
+                <w:b/>
+                <w:bCs/>
+                <w:color w:val="166534"/>
+                <w:sz w:val="18"/>
+                <w:szCs w:val="18"/>
+              </w:rPr>
+              <w:t xml:space="preserve">Var</w:t>
+            </w:r>
+          </w:p>
+        </w:tc>
+        <w:tc>
+          <w:tcPr>
+            <w:tcW w:type="dxa" w:w="3600"/>
+            <w:tcBorders>
+              <w:top w:val="single" w:color="D9D9E3" w:sz="4"/>
+              <w:left w:val="single" w:color="D9D9E3" w:sz="4"/>
+              <w:bottom w:val="single" w:color="D9D9E3" w:sz="4"/>
+              <w:right w:val="single" w:color="D9D9E3" w:sz="4"/>
+            </w:tcBorders>
+            <w:tcMar>
+              <w:top w:type="dxa" w:w="60"/>
+              <w:left w:type="dxa" w:w="100"/>
+              <w:bottom w:type="dxa" w:w="60"/>
+              <w:right w:type="dxa" w:w="100"/>
+            </w:tcMar>
+          </w:tcPr>
+          <w:p>
+            <w:r>
+              <w:rPr>
+                <w:sz w:val="18"/>
+                <w:szCs w:val="18"/>
+              </w:rPr>
+              <w:t xml:space="preserve">Evet — Int story-points, E2E faz9-points</w:t>
+            </w:r>
+          </w:p>
+        </w:tc>
+        <w:tc>
+          <w:tcPr>
+            <w:tcW w:type="dxa" w:w="5000"/>
+            <w:tcBorders>
+              <w:top w:val="single" w:color="D9D9E3" w:sz="4"/>
+              <w:left w:val="single" w:color="D9D9E3" w:sz="4"/>
+              <w:bottom w:val="single" w:color="D9D9E3" w:sz="4"/>
+              <w:right w:val="single" w:color="D9D9E3" w:sz="4"/>
+            </w:tcBorders>
+            <w:tcMar>
+              <w:top w:type="dxa" w:w="60"/>
+              <w:left w:type="dxa" w:w="100"/>
+              <w:bottom w:type="dxa" w:w="60"/>
+              <w:right w:type="dxa" w:w="100"/>
+            </w:tcMar>
+          </w:tcPr>
+          <w:p>
+            <w:r>
+              <w:rPr>
+                <w:sz w:val="18"/>
+                <w:szCs w:val="18"/>
+              </w:rPr>
+              <w:t xml:space="preserve">Veritabanı tetikleyicisiyle; alt görev kalkınca puan yeniden elle girilir</w:t>
+            </w:r>
+          </w:p>
+        </w:tc>
+      </w:tr>
+      <w:tr>
+        <w:tc>
+          <w:tcPr>
+            <w:tcW w:type="dxa" w:w="4300"/>
+            <w:tcBorders>
+              <w:top w:val="single" w:color="D9D9E3" w:sz="4"/>
+              <w:left w:val="single" w:color="D9D9E3" w:sz="4"/>
+              <w:bottom w:val="single" w:color="D9D9E3" w:sz="4"/>
+              <w:right w:val="single" w:color="D9D9E3" w:sz="4"/>
+            </w:tcBorders>
+            <w:tcMar>
+              <w:top w:type="dxa" w:w="60"/>
+              <w:left w:type="dxa" w:w="100"/>
+              <w:bottom w:type="dxa" w:w="60"/>
+              <w:right w:type="dxa" w:w="100"/>
+            </w:tcMar>
+          </w:tcPr>
+          <w:p>
+            <w:r>
+              <w:rPr>
+                <w:sz w:val="18"/>
+                <w:szCs w:val="18"/>
+              </w:rPr>
+              <w:t xml:space="preserve">Sprint toplam puanı ve kişilere dağılımı</w:t>
+            </w:r>
+          </w:p>
+        </w:tc>
+        <w:tc>
+          <w:tcPr>
+            <w:tcW w:type="dxa" w:w="1100"/>
+            <w:tcBorders>
+              <w:top w:val="single" w:color="D9D9E3" w:sz="4"/>
+              <w:left w:val="single" w:color="D9D9E3" w:sz="4"/>
+              <w:bottom w:val="single" w:color="D9D9E3" w:sz="4"/>
+              <w:right w:val="single" w:color="D9D9E3" w:sz="4"/>
+            </w:tcBorders>
+            <w:shd w:fill="DCFCE7" w:color="auto" w:val="clear"/>
+            <w:tcMar>
+              <w:top w:type="dxa" w:w="60"/>
+              <w:left w:type="dxa" w:w="100"/>
+              <w:bottom w:type="dxa" w:w="60"/>
+              <w:right w:type="dxa" w:w="100"/>
+            </w:tcMar>
+          </w:tcPr>
+          <w:p>
+            <w:r>
+              <w:rPr>
+                <w:b/>
+                <w:bCs/>
+                <w:color w:val="166534"/>
+                <w:sz w:val="18"/>
+                <w:szCs w:val="18"/>
+              </w:rPr>
+              <w:t xml:space="preserve">Var</w:t>
+            </w:r>
+          </w:p>
+        </w:tc>
+        <w:tc>
+          <w:tcPr>
+            <w:tcW w:type="dxa" w:w="3600"/>
+            <w:tcBorders>
+              <w:top w:val="single" w:color="D9D9E3" w:sz="4"/>
+              <w:left w:val="single" w:color="D9D9E3" w:sz="4"/>
+              <w:bottom w:val="single" w:color="D9D9E3" w:sz="4"/>
+              <w:right w:val="single" w:color="D9D9E3" w:sz="4"/>
+            </w:tcBorders>
+            <w:tcMar>
+              <w:top w:type="dxa" w:w="60"/>
+              <w:left w:type="dxa" w:w="100"/>
+              <w:bottom w:type="dxa" w:w="60"/>
+              <w:right w:type="dxa" w:w="100"/>
+            </w:tcMar>
+          </w:tcPr>
+          <w:p>
+            <w:r>
+              <w:rPr>
+                <w:sz w:val="18"/>
+                <w:szCs w:val="18"/>
+              </w:rPr>
+              <w:t xml:space="preserve">Evet — Int story-points, E2E faz9-points</w:t>
+            </w:r>
+          </w:p>
+        </w:tc>
+        <w:tc>
+          <w:tcPr>
+            <w:tcW w:type="dxa" w:w="5000"/>
+            <w:tcBorders>
+              <w:top w:val="single" w:color="D9D9E3" w:sz="4"/>
+              <w:left w:val="single" w:color="D9D9E3" w:sz="4"/>
+              <w:bottom w:val="single" w:color="D9D9E3" w:sz="4"/>
+              <w:right w:val="single" w:color="D9D9E3" w:sz="4"/>
+            </w:tcBorders>
+            <w:tcMar>
+              <w:top w:type="dxa" w:w="60"/>
+              <w:left w:type="dxa" w:w="100"/>
+              <w:bottom w:type="dxa" w:w="60"/>
+              <w:right w:type="dxa" w:w="100"/>
+            </w:tcMar>
+          </w:tcPr>
+          <w:p>
+            <w:r>
+              <w:rPr>
+                <w:sz w:val="18"/>
+                <w:szCs w:val="18"/>
+              </w:rPr>
+              <w:t xml:space="preserve">Sprint özeti: toplam, biten, kişi başına puan ve yüzde</w:t>
+            </w:r>
+          </w:p>
+        </w:tc>
+      </w:tr>
+      <w:tr>
+        <w:tc>
+          <w:tcPr>
+            <w:tcW w:type="dxa" w:w="4300"/>
+            <w:tcBorders>
+              <w:top w:val="single" w:color="D9D9E3" w:sz="4"/>
+              <w:left w:val="single" w:color="D9D9E3" w:sz="4"/>
+              <w:bottom w:val="single" w:color="D9D9E3" w:sz="4"/>
+              <w:right w:val="single" w:color="D9D9E3" w:sz="4"/>
+            </w:tcBorders>
+            <w:tcMar>
+              <w:top w:type="dxa" w:w="60"/>
+              <w:left w:type="dxa" w:w="100"/>
+              <w:bottom w:type="dxa" w:w="60"/>
+              <w:right w:type="dxa" w:w="100"/>
+            </w:tcMar>
+          </w:tcPr>
+          <w:p>
+            <w:r>
+              <w:rPr>
+                <w:sz w:val="18"/>
+                <w:szCs w:val="18"/>
+              </w:rPr>
+              <w:t xml:space="preserve">Atananın görev yüzdesi, sprint toplam yüzdesi</w:t>
+            </w:r>
+          </w:p>
+        </w:tc>
+        <w:tc>
+          <w:tcPr>
+            <w:tcW w:type="dxa" w:w="1100"/>
+            <w:tcBorders>
+              <w:top w:val="single" w:color="D9D9E3" w:sz="4"/>
+              <w:left w:val="single" w:color="D9D9E3" w:sz="4"/>
+              <w:bottom w:val="single" w:color="D9D9E3" w:sz="4"/>
+              <w:right w:val="single" w:color="D9D9E3" w:sz="4"/>
+            </w:tcBorders>
+            <w:shd w:fill="DCFCE7" w:color="auto" w:val="clear"/>
+            <w:tcMar>
+              <w:top w:type="dxa" w:w="60"/>
+              <w:left w:type="dxa" w:w="100"/>
+              <w:bottom w:type="dxa" w:w="60"/>
+              <w:right w:type="dxa" w:w="100"/>
+            </w:tcMar>
+          </w:tcPr>
+          <w:p>
+            <w:r>
+              <w:rPr>
+                <w:b/>
+                <w:bCs/>
+                <w:color w:val="166534"/>
+                <w:sz w:val="18"/>
+                <w:szCs w:val="18"/>
+              </w:rPr>
+              <w:t xml:space="preserve">Var</w:t>
+            </w:r>
+          </w:p>
+        </w:tc>
+        <w:tc>
+          <w:tcPr>
+            <w:tcW w:type="dxa" w:w="3600"/>
+            <w:tcBorders>
+              <w:top w:val="single" w:color="D9D9E3" w:sz="4"/>
+              <w:left w:val="single" w:color="D9D9E3" w:sz="4"/>
+              <w:bottom w:val="single" w:color="D9D9E3" w:sz="4"/>
+              <w:right w:val="single" w:color="D9D9E3" w:sz="4"/>
+            </w:tcBorders>
+            <w:tcMar>
+              <w:top w:type="dxa" w:w="60"/>
+              <w:left w:type="dxa" w:w="100"/>
+              <w:bottom w:type="dxa" w:w="60"/>
+              <w:right w:type="dxa" w:w="100"/>
+            </w:tcMar>
+          </w:tcPr>
+          <w:p>
+            <w:r>
+              <w:rPr>
+                <w:sz w:val="18"/>
+                <w:szCs w:val="18"/>
+              </w:rPr>
+              <w:t xml:space="preserve">Evet — Int story-points, E2E faz9-points</w:t>
+            </w:r>
+          </w:p>
+        </w:tc>
+        <w:tc>
+          <w:tcPr>
+            <w:tcW w:type="dxa" w:w="5000"/>
+            <w:tcBorders>
+              <w:top w:val="single" w:color="D9D9E3" w:sz="4"/>
+              <w:left w:val="single" w:color="D9D9E3" w:sz="4"/>
+              <w:bottom w:val="single" w:color="D9D9E3" w:sz="4"/>
+              <w:right w:val="single" w:color="D9D9E3" w:sz="4"/>
+            </w:tcBorders>
+            <w:tcMar>
+              <w:top w:type="dxa" w:w="60"/>
+              <w:left w:type="dxa" w:w="100"/>
+              <w:bottom w:type="dxa" w:w="60"/>
+              <w:right w:type="dxa" w:w="100"/>
+            </w:tcMar>
+          </w:tcPr>
+          <w:p>
+            <w:r>
+              <w:rPr>
+                <w:sz w:val="18"/>
+                <w:szCs w:val="18"/>
+              </w:rPr>
+              <w:t xml:space="preserve">Puan ağırlıklı; alt görevli işte alt görevlerden türetilir</w:t>
+            </w:r>
+          </w:p>
+        </w:tc>
+      </w:tr>
+      <w:tr>
+        <w:tc>
+          <w:tcPr>
+            <w:tcW w:type="dxa" w:w="4300"/>
+            <w:tcBorders>
+              <w:top w:val="single" w:color="D9D9E3" w:sz="4"/>
+              <w:left w:val="single" w:color="D9D9E3" w:sz="4"/>
+              <w:bottom w:val="single" w:color="D9D9E3" w:sz="4"/>
+              <w:right w:val="single" w:color="D9D9E3" w:sz="4"/>
+            </w:tcBorders>
+            <w:tcMar>
+              <w:top w:type="dxa" w:w="60"/>
+              <w:left w:type="dxa" w:w="100"/>
+              <w:bottom w:type="dxa" w:w="60"/>
+              <w:right w:type="dxa" w:w="100"/>
+            </w:tcMar>
+          </w:tcPr>
+          <w:p>
+            <w:r>
+              <w:rPr>
+                <w:sz w:val="18"/>
+                <w:szCs w:val="18"/>
+              </w:rPr>
+              <w:t xml:space="preserve">Önceliğe göre renklendirme</w:t>
+            </w:r>
+          </w:p>
+        </w:tc>
+        <w:tc>
+          <w:tcPr>
+            <w:tcW w:type="dxa" w:w="1100"/>
+            <w:tcBorders>
+              <w:top w:val="single" w:color="D9D9E3" w:sz="4"/>
+              <w:left w:val="single" w:color="D9D9E3" w:sz="4"/>
+              <w:bottom w:val="single" w:color="D9D9E3" w:sz="4"/>
+              <w:right w:val="single" w:color="D9D9E3" w:sz="4"/>
+            </w:tcBorders>
+            <w:shd w:fill="DCFCE7" w:color="auto" w:val="clear"/>
+            <w:tcMar>
+              <w:top w:type="dxa" w:w="60"/>
+              <w:left w:type="dxa" w:w="100"/>
+              <w:bottom w:type="dxa" w:w="60"/>
+              <w:right w:type="dxa" w:w="100"/>
+            </w:tcMar>
+          </w:tcPr>
+          <w:p>
+            <w:r>
+              <w:rPr>
+                <w:b/>
+                <w:bCs/>
+                <w:color w:val="166534"/>
+                <w:sz w:val="18"/>
+                <w:szCs w:val="18"/>
+              </w:rPr>
+              <w:t xml:space="preserve">Var</w:t>
+            </w:r>
+          </w:p>
+        </w:tc>
+        <w:tc>
+          <w:tcPr>
+            <w:tcW w:type="dxa" w:w="3600"/>
+            <w:tcBorders>
+              <w:top w:val="single" w:color="D9D9E3" w:sz="4"/>
+              <w:left w:val="single" w:color="D9D9E3" w:sz="4"/>
+              <w:bottom w:val="single" w:color="D9D9E3" w:sz="4"/>
+              <w:right w:val="single" w:color="D9D9E3" w:sz="4"/>
+            </w:tcBorders>
+            <w:tcMar>
+              <w:top w:type="dxa" w:w="60"/>
+              <w:left w:type="dxa" w:w="100"/>
+              <w:bottom w:type="dxa" w:w="60"/>
+              <w:right w:type="dxa" w:w="100"/>
+            </w:tcMar>
+          </w:tcPr>
+          <w:p>
+            <w:r>
+              <w:rPr>
+                <w:sz w:val="18"/>
+                <w:szCs w:val="18"/>
+              </w:rPr>
+              <w:t xml:space="preserve">Evet — E2E faz9-points</w:t>
+            </w:r>
+          </w:p>
+        </w:tc>
+        <w:tc>
+          <w:tcPr>
+            <w:tcW w:type="dxa" w:w="5000"/>
+            <w:tcBorders>
+              <w:top w:val="single" w:color="D9D9E3" w:sz="4"/>
+              <w:left w:val="single" w:color="D9D9E3" w:sz="4"/>
+              <w:bottom w:val="single" w:color="D9D9E3" w:sz="4"/>
+              <w:right w:val="single" w:color="D9D9E3" w:sz="4"/>
+            </w:tcBorders>
+            <w:tcMar>
+              <w:top w:type="dxa" w:w="60"/>
+              <w:left w:type="dxa" w:w="100"/>
+              <w:bottom w:type="dxa" w:w="60"/>
+              <w:right w:type="dxa" w:w="100"/>
+            </w:tcMar>
+          </w:tcPr>
+          <w:p>
+            <w:r>
+              <w:rPr>
+                <w:sz w:val="18"/>
+                <w:szCs w:val="18"/>
+              </w:rPr>
+              <w:t xml:space="preserve">Board ve Backlog'da aç/kapa; tercih kullanıcıya özel</w:t>
+            </w:r>
+          </w:p>
+        </w:tc>
+      </w:tr>
+      <w:tr>
+        <w:tc>
+          <w:tcPr>
+            <w:tcW w:type="dxa" w:w="4300"/>
+            <w:tcBorders>
+              <w:top w:val="single" w:color="D9D9E3" w:sz="4"/>
+              <w:left w:val="single" w:color="D9D9E3" w:sz="4"/>
+              <w:bottom w:val="single" w:color="D9D9E3" w:sz="4"/>
+              <w:right w:val="single" w:color="D9D9E3" w:sz="4"/>
+            </w:tcBorders>
+            <w:tcMar>
+              <w:top w:type="dxa" w:w="60"/>
+              <w:left w:type="dxa" w:w="100"/>
+              <w:bottom w:type="dxa" w:w="60"/>
+              <w:right w:type="dxa" w:w="100"/>
+            </w:tcMar>
+          </w:tcPr>
+          <w:p>
+            <w:r>
+              <w:rPr>
+                <w:sz w:val="18"/>
+                <w:szCs w:val="18"/>
+              </w:rPr>
+              <w:t xml:space="preserve">Sprint başına Kanban panosu</w:t>
+            </w:r>
+          </w:p>
+        </w:tc>
+        <w:tc>
+          <w:tcPr>
+            <w:tcW w:type="dxa" w:w="1100"/>
+            <w:tcBorders>
+              <w:top w:val="single" w:color="D9D9E3" w:sz="4"/>
+              <w:left w:val="single" w:color="D9D9E3" w:sz="4"/>
+              <w:bottom w:val="single" w:color="D9D9E3" w:sz="4"/>
+              <w:right w:val="single" w:color="D9D9E3" w:sz="4"/>
+            </w:tcBorders>
+            <w:shd w:fill="DCFCE7" w:color="auto" w:val="clear"/>
+            <w:tcMar>
+              <w:top w:type="dxa" w:w="60"/>
+              <w:left w:type="dxa" w:w="100"/>
+              <w:bottom w:type="dxa" w:w="60"/>
+              <w:right w:type="dxa" w:w="100"/>
+            </w:tcMar>
+          </w:tcPr>
+          <w:p>
+            <w:r>
+              <w:rPr>
+                <w:b/>
+                <w:bCs/>
+                <w:color w:val="166534"/>
+                <w:sz w:val="18"/>
+                <w:szCs w:val="18"/>
+              </w:rPr>
+              <w:t xml:space="preserve">Var</w:t>
+            </w:r>
+          </w:p>
+        </w:tc>
+        <w:tc>
+          <w:tcPr>
+            <w:tcW w:type="dxa" w:w="3600"/>
+            <w:tcBorders>
+              <w:top w:val="single" w:color="D9D9E3" w:sz="4"/>
+              <w:left w:val="single" w:color="D9D9E3" w:sz="4"/>
+              <w:bottom w:val="single" w:color="D9D9E3" w:sz="4"/>
+              <w:right w:val="single" w:color="D9D9E3" w:sz="4"/>
+            </w:tcBorders>
+            <w:tcMar>
+              <w:top w:type="dxa" w:w="60"/>
+              <w:left w:type="dxa" w:w="100"/>
+              <w:bottom w:type="dxa" w:w="60"/>
+              <w:right w:type="dxa" w:w="100"/>
+            </w:tcMar>
+          </w:tcPr>
+          <w:p>
+            <w:r>
+              <w:rPr>
+                <w:sz w:val="18"/>
+                <w:szCs w:val="18"/>
+              </w:rPr>
+              <w:t xml:space="preserve">Evet — E2E faz2-board, faz9-points</w:t>
+            </w:r>
+          </w:p>
+        </w:tc>
+        <w:tc>
+          <w:tcPr>
+            <w:tcW w:type="dxa" w:w="5000"/>
+            <w:tcBorders>
+              <w:top w:val="single" w:color="D9D9E3" w:sz="4"/>
+              <w:left w:val="single" w:color="D9D9E3" w:sz="4"/>
+              <w:bottom w:val="single" w:color="D9D9E3" w:sz="4"/>
+              <w:right w:val="single" w:color="D9D9E3" w:sz="4"/>
+            </w:tcBorders>
+            <w:tcMar>
+              <w:top w:type="dxa" w:w="60"/>
+              <w:left w:type="dxa" w:w="100"/>
+              <w:bottom w:type="dxa" w:w="60"/>
+              <w:right w:type="dxa" w:w="100"/>
+            </w:tcMar>
+          </w:tcPr>
+          <w:p>
+            <w:r>
+              <w:rPr>
+                <w:sz w:val="18"/>
+                <w:szCs w:val="18"/>
+              </w:rPr>
+              <w:t xml:space="preserve">Sprint panosu + sprint menüsünden doğrudan açma</w:t>
+            </w:r>
+          </w:p>
+        </w:tc>
+      </w:tr>
+      <w:tr>
+        <w:tc>
+          <w:tcPr>
+            <w:tcW w:type="dxa" w:w="4300"/>
+            <w:tcBorders>
+              <w:top w:val="single" w:color="D9D9E3" w:sz="4"/>
+              <w:left w:val="single" w:color="D9D9E3" w:sz="4"/>
+              <w:bottom w:val="single" w:color="D9D9E3" w:sz="4"/>
+              <w:right w:val="single" w:color="D9D9E3" w:sz="4"/>
+            </w:tcBorders>
+            <w:tcMar>
+              <w:top w:type="dxa" w:w="60"/>
+              <w:left w:type="dxa" w:w="100"/>
+              <w:bottom w:type="dxa" w:w="60"/>
+              <w:right w:type="dxa" w:w="100"/>
+            </w:tcMar>
+          </w:tcPr>
+          <w:p>
+            <w:r>
+              <w:rPr>
+                <w:sz w:val="18"/>
+                <w:szCs w:val="18"/>
+              </w:rPr>
+              <w:t xml:space="preserve">Sprint'i JSON olarak dışa aktarma</w:t>
+            </w:r>
+          </w:p>
+        </w:tc>
+        <w:tc>
+          <w:tcPr>
+            <w:tcW w:type="dxa" w:w="1100"/>
+            <w:tcBorders>
+              <w:top w:val="single" w:color="D9D9E3" w:sz="4"/>
+              <w:left w:val="single" w:color="D9D9E3" w:sz="4"/>
+              <w:bottom w:val="single" w:color="D9D9E3" w:sz="4"/>
+              <w:right w:val="single" w:color="D9D9E3" w:sz="4"/>
+            </w:tcBorders>
+            <w:shd w:fill="DCFCE7" w:color="auto" w:val="clear"/>
+            <w:tcMar>
+              <w:top w:type="dxa" w:w="60"/>
+              <w:left w:type="dxa" w:w="100"/>
+              <w:bottom w:type="dxa" w:w="60"/>
+              <w:right w:type="dxa" w:w="100"/>
+            </w:tcMar>
+          </w:tcPr>
+          <w:p>
+            <w:r>
+              <w:rPr>
+                <w:b/>
+                <w:bCs/>
+                <w:color w:val="166534"/>
+                <w:sz w:val="18"/>
+                <w:szCs w:val="18"/>
+              </w:rPr>
+              <w:t xml:space="preserve">Var</w:t>
+            </w:r>
+          </w:p>
+        </w:tc>
+        <w:tc>
+          <w:tcPr>
+            <w:tcW w:type="dxa" w:w="3600"/>
+            <w:tcBorders>
+              <w:top w:val="single" w:color="D9D9E3" w:sz="4"/>
+              <w:left w:val="single" w:color="D9D9E3" w:sz="4"/>
+              <w:bottom w:val="single" w:color="D9D9E3" w:sz="4"/>
+              <w:right w:val="single" w:color="D9D9E3" w:sz="4"/>
+            </w:tcBorders>
+            <w:tcMar>
+              <w:top w:type="dxa" w:w="60"/>
+              <w:left w:type="dxa" w:w="100"/>
+              <w:bottom w:type="dxa" w:w="60"/>
+              <w:right w:type="dxa" w:w="100"/>
+            </w:tcMar>
+          </w:tcPr>
+          <w:p>
+            <w:r>
+              <w:rPr>
+                <w:sz w:val="18"/>
+                <w:szCs w:val="18"/>
+              </w:rPr>
+              <w:t xml:space="preserve">Evet — Int story-points, E2E faz9-points</w:t>
+            </w:r>
+          </w:p>
+        </w:tc>
+        <w:tc>
+          <w:tcPr>
+            <w:tcW w:type="dxa" w:w="5000"/>
+            <w:tcBorders>
+              <w:top w:val="single" w:color="D9D9E3" w:sz="4"/>
+              <w:left w:val="single" w:color="D9D9E3" w:sz="4"/>
+              <w:bottom w:val="single" w:color="D9D9E3" w:sz="4"/>
+              <w:right w:val="single" w:color="D9D9E3" w:sz="4"/>
+            </w:tcBorders>
+            <w:tcMar>
+              <w:top w:type="dxa" w:w="60"/>
+              <w:left w:type="dxa" w:w="100"/>
+              <w:bottom w:type="dxa" w:w="60"/>
+              <w:right w:type="dxa" w:w="100"/>
+            </w:tcMar>
+          </w:tcPr>
+          <w:p>
+            <w:r>
+              <w:rPr>
+                <w:sz w:val="18"/>
+                <w:szCs w:val="18"/>
+              </w:rPr>
+              <w:t xml:space="preserve">Özellikler, toplamlar, kişi dağılımı, öğeler, bağımlılıklar, bağlantılar</w:t>
+            </w:r>
+          </w:p>
+        </w:tc>
+      </w:tr>
+      <w:tr>
+        <w:tc>
+          <w:tcPr>
+            <w:tcW w:type="dxa" w:w="4300"/>
+            <w:tcBorders>
+              <w:top w:val="single" w:color="D9D9E3" w:sz="4"/>
+              <w:left w:val="single" w:color="D9D9E3" w:sz="4"/>
+              <w:bottom w:val="single" w:color="D9D9E3" w:sz="4"/>
+              <w:right w:val="single" w:color="D9D9E3" w:sz="4"/>
+            </w:tcBorders>
+            <w:tcMar>
+              <w:top w:type="dxa" w:w="60"/>
+              <w:left w:type="dxa" w:w="100"/>
+              <w:bottom w:type="dxa" w:w="60"/>
+              <w:right w:type="dxa" w:w="100"/>
+            </w:tcMar>
+          </w:tcPr>
+          <w:p>
+            <w:r>
+              <w:rPr>
+                <w:sz w:val="18"/>
+                <w:szCs w:val="18"/>
+              </w:rPr>
+              <w:t xml:space="preserve">Görev ve sprint için kalıcı URL</w:t>
+            </w:r>
+          </w:p>
+        </w:tc>
+        <w:tc>
+          <w:tcPr>
+            <w:tcW w:type="dxa" w:w="1100"/>
+            <w:tcBorders>
+              <w:top w:val="single" w:color="D9D9E3" w:sz="4"/>
+              <w:left w:val="single" w:color="D9D9E3" w:sz="4"/>
+              <w:bottom w:val="single" w:color="D9D9E3" w:sz="4"/>
+              <w:right w:val="single" w:color="D9D9E3" w:sz="4"/>
+            </w:tcBorders>
+            <w:shd w:fill="DCFCE7" w:color="auto" w:val="clear"/>
+            <w:tcMar>
+              <w:top w:type="dxa" w:w="60"/>
+              <w:left w:type="dxa" w:w="100"/>
+              <w:bottom w:type="dxa" w:w="60"/>
+              <w:right w:type="dxa" w:w="100"/>
+            </w:tcMar>
+          </w:tcPr>
+          <w:p>
+            <w:r>
+              <w:rPr>
+                <w:b/>
+                <w:bCs/>
+                <w:color w:val="166534"/>
+                <w:sz w:val="18"/>
+                <w:szCs w:val="18"/>
+              </w:rPr>
+              <w:t xml:space="preserve">Var</w:t>
+            </w:r>
+          </w:p>
+        </w:tc>
+        <w:tc>
+          <w:tcPr>
+            <w:tcW w:type="dxa" w:w="3600"/>
+            <w:tcBorders>
+              <w:top w:val="single" w:color="D9D9E3" w:sz="4"/>
+              <w:left w:val="single" w:color="D9D9E3" w:sz="4"/>
+              <w:bottom w:val="single" w:color="D9D9E3" w:sz="4"/>
+              <w:right w:val="single" w:color="D9D9E3" w:sz="4"/>
+            </w:tcBorders>
+            <w:tcMar>
+              <w:top w:type="dxa" w:w="60"/>
+              <w:left w:type="dxa" w:w="100"/>
+              <w:bottom w:type="dxa" w:w="60"/>
+              <w:right w:type="dxa" w:w="100"/>
+            </w:tcMar>
+          </w:tcPr>
+          <w:p>
+            <w:r>
+              <w:rPr>
+                <w:sz w:val="18"/>
+                <w:szCs w:val="18"/>
+              </w:rPr>
+              <w:t xml:space="preserve">Evet — E2E faz1-detail, faz9-points</w:t>
+            </w:r>
+          </w:p>
+        </w:tc>
+        <w:tc>
+          <w:tcPr>
+            <w:tcW w:type="dxa" w:w="5000"/>
+            <w:tcBorders>
+              <w:top w:val="single" w:color="D9D9E3" w:sz="4"/>
+              <w:left w:val="single" w:color="D9D9E3" w:sz="4"/>
+              <w:bottom w:val="single" w:color="D9D9E3" w:sz="4"/>
+              <w:right w:val="single" w:color="D9D9E3" w:sz="4"/>
+            </w:tcBorders>
+            <w:tcMar>
+              <w:top w:type="dxa" w:w="60"/>
+              <w:left w:type="dxa" w:w="100"/>
+              <w:bottom w:type="dxa" w:w="60"/>
+              <w:right w:type="dxa" w:w="100"/>
+            </w:tcMar>
+          </w:tcPr>
+          <w:p>
+            <w:r>
+              <w:rPr>
+                <w:sz w:val="18"/>
+                <w:szCs w:val="18"/>
+              </w:rPr>
+              <w:t xml:space="preserve">/items/MOB-12 ve /sprints/&lt;id&gt;; bağlantı kopyalama menüsü var</w:t>
+            </w:r>
+          </w:p>
+        </w:tc>
+      </w:tr>
     </w:tbl>
     <w:p>
       <w:pPr>
@@ -10822,7 +11702,7 @@
           <w:sz w:val="21"/>
           <w:szCs w:val="21"/>
         </w:rPr>
-        <w:t xml:space="preserve">Toplam 85 fonksiyon: ✅ Var 74 · 🟡 Kısmen 0 · ❌ Yok 11. Var olan 74 fonksiyonun tamamı otomatik testle kanıtlıdır.</w:t>
+        <w:t xml:space="preserve">Toplam 89 fonksiyon: ✅ Var 79 · 🟡 Kısmen 0 · ❌ Yok 10. Var olanlardan 79 tanesi otomatik testle kanıtlı, 0 tanesi kanıtsız (aşağıda).</w:t>
       </w:r>
     </w:p>
     <w:p>
@@ -10849,6 +11729,32 @@
           <w:szCs w:val="21"/>
         </w:rPr>
         <w:t xml:space="preserve"> sol menü sprint ağacı, sprint listesini kopyalama, tam sürükle-bırak (backlog ↔ sprint ↔ sprint), sürükleyerek alt görev, denetim logu ekranı, sprint Excel dışa/içe aktarma (bağımlılıklarla), Space/Sprint zip yedek ve geri yükleme, dokümanda görsel, Word’e aktarma, Undo/Redo ve ID bağlantısı testle kanıtlandı.</w:t>
+      </w:r>
+    </w:p>
+    <w:p>
+      <w:pPr>
+        <w:pStyle w:val="ListParagraph"/>
+        <w:numPr>
+          <w:ilvl w:val="0"/>
+          <w:numId w:val="2"/>
+        </w:numPr>
+        <w:spacing w:after="60"/>
+      </w:pPr>
+      <w:r>
+        <w:rPr>
+          <w:b/>
+          <w:bCs/>
+          <w:sz w:val="21"/>
+          <w:szCs w:val="21"/>
+        </w:rPr>
+        <w:t xml:space="preserve">Faz 9.1’de tamamlananlar (yönetici isteği, 11 madde):</w:t>
+      </w:r>
+      <w:r>
+        <w:rPr>
+          <w:sz w:val="21"/>
+          <w:szCs w:val="21"/>
+        </w:rPr>
+        <w:t xml:space="preserve"> her göreve Story Point (1–55), alt görev toplamı, atananın yüzdesi, sprint toplam puan/yüzde ve kişi dağılımı, önceliğe göre renk, sprint Kanban kısayolu, sprint JSON dışa aktarma, görev ve sprint URL’si.</w:t>
       </w:r>
     </w:p>
     <w:p>

</xml_diff>